<commit_message>
feat: implement local tmp folder compilation and cleanup flow as specified
</commit_message>
<xml_diff>
--- a/template.docx
+++ b/template.docx
@@ -22,6 +22,11 @@
           <w:rFonts w:ascii="Arial" w:cs="Arial" w:eastAsia="Arial" w:hAnsi="Arial"/>
         </w:rPr>
         <w:t xml:space="preserve">This is a placeholder for the documenting-code base template. Append new content below.</w:t>
+      </w:r>
+    </w:p>
+    <w:p>
+      <w:r>
+        <w:t xml:space="preserve">{{content}}</w:t>
       </w:r>
     </w:p>
     <w:sectPr>

</xml_diff>